<commit_message>
plantação de milho concluída
</commit_message>
<xml_diff>
--- a/Dialogos.docx
+++ b/Dialogos.docx
@@ -270,34 +270,65 @@
           <w14:ligatures w14:val="none"/>
         </w:rPr>
       </w:pPr>
-      <w:r>
-        <w:rPr>
-          <w:rFonts w:ascii="Times New Roman" w:eastAsia="Times New Roman" w:hAnsi="Times New Roman" w:cs="Times New Roman"/>
-          <w:kern w:val="0"/>
-          <w:lang w:eastAsia="pt-BR"/>
-          <w14:ligatures w14:val="none"/>
-        </w:rPr>
-        <w:t>Agrobot:</w:t>
-      </w:r>
-    </w:p>
-    <w:p>
-      <w:pPr>
-        <w:spacing w:before="100" w:beforeAutospacing="1" w:after="100" w:afterAutospacing="1" w:line="240" w:lineRule="auto"/>
-        <w:rPr>
-          <w:rFonts w:ascii="Times New Roman" w:eastAsia="Times New Roman" w:hAnsi="Times New Roman" w:cs="Times New Roman"/>
-          <w:kern w:val="0"/>
-          <w:lang w:eastAsia="pt-BR"/>
-          <w14:ligatures w14:val="none"/>
-        </w:rPr>
-      </w:pPr>
-      <w:r>
-        <w:rPr>
-          <w:rFonts w:ascii="Times New Roman" w:eastAsia="Times New Roman" w:hAnsi="Times New Roman" w:cs="Times New Roman"/>
-          <w:kern w:val="0"/>
-          <w:lang w:eastAsia="pt-BR"/>
-          <w14:ligatures w14:val="none"/>
-        </w:rPr>
-        <w:t>Ufa! Finalmente fora da caixa! Olá, chefe! Sou o Agrobot, seu assistente agrícola. Bateria em 100% e pronto para o trabalho! Por onde começamos?</w:t>
+      <w:proofErr w:type="spellStart"/>
+      <w:r>
+        <w:rPr>
+          <w:rFonts w:ascii="Times New Roman" w:eastAsia="Times New Roman" w:hAnsi="Times New Roman" w:cs="Times New Roman"/>
+          <w:kern w:val="0"/>
+          <w:lang w:eastAsia="pt-BR"/>
+          <w14:ligatures w14:val="none"/>
+        </w:rPr>
+        <w:t>Agrobot</w:t>
+      </w:r>
+      <w:proofErr w:type="spellEnd"/>
+      <w:r>
+        <w:rPr>
+          <w:rFonts w:ascii="Times New Roman" w:eastAsia="Times New Roman" w:hAnsi="Times New Roman" w:cs="Times New Roman"/>
+          <w:kern w:val="0"/>
+          <w:lang w:eastAsia="pt-BR"/>
+          <w14:ligatures w14:val="none"/>
+        </w:rPr>
+        <w:t>:</w:t>
+      </w:r>
+    </w:p>
+    <w:p>
+      <w:pPr>
+        <w:spacing w:before="100" w:beforeAutospacing="1" w:after="100" w:afterAutospacing="1" w:line="240" w:lineRule="auto"/>
+        <w:rPr>
+          <w:rFonts w:ascii="Times New Roman" w:eastAsia="Times New Roman" w:hAnsi="Times New Roman" w:cs="Times New Roman"/>
+          <w:kern w:val="0"/>
+          <w:lang w:eastAsia="pt-BR"/>
+          <w14:ligatures w14:val="none"/>
+        </w:rPr>
+      </w:pPr>
+      <w:r>
+        <w:rPr>
+          <w:rFonts w:ascii="Times New Roman" w:eastAsia="Times New Roman" w:hAnsi="Times New Roman" w:cs="Times New Roman"/>
+          <w:kern w:val="0"/>
+          <w:lang w:eastAsia="pt-BR"/>
+          <w14:ligatures w14:val="none"/>
+        </w:rPr>
+        <w:t xml:space="preserve">Ufa! Finalmente fora da caixa! Olá, chefe! Sou o </w:t>
+      </w:r>
+      <w:proofErr w:type="spellStart"/>
+      <w:r>
+        <w:rPr>
+          <w:rFonts w:ascii="Times New Roman" w:eastAsia="Times New Roman" w:hAnsi="Times New Roman" w:cs="Times New Roman"/>
+          <w:kern w:val="0"/>
+          <w:lang w:eastAsia="pt-BR"/>
+          <w14:ligatures w14:val="none"/>
+        </w:rPr>
+        <w:t>Agrobot</w:t>
+      </w:r>
+      <w:proofErr w:type="spellEnd"/>
+      <w:r>
+        <w:rPr>
+          <w:rFonts w:ascii="Times New Roman" w:eastAsia="Times New Roman" w:hAnsi="Times New Roman" w:cs="Times New Roman"/>
+          <w:kern w:val="0"/>
+          <w:lang w:eastAsia="pt-BR"/>
+          <w14:ligatures w14:val="none"/>
+        </w:rPr>
+        <w:t>, seu assistente agrícola. Bateria em 100% e pronto para o trabalho! Por onde começamos?</w:t>
       </w:r>
     </w:p>
     <w:p>
@@ -337,9 +368,318 @@
           <w:lang w:eastAsia="pt-BR"/>
           <w14:ligatures w14:val="none"/>
         </w:rPr>
-        <w:t xml:space="preserve">Missão </w:t>
-      </w:r>
-      <w:r>
+        <w:t>Missão 2</w:t>
+      </w:r>
+    </w:p>
+    <w:p>
+      <w:pPr>
+        <w:spacing w:before="100" w:beforeAutospacing="1" w:after="100" w:afterAutospacing="1" w:line="240" w:lineRule="auto"/>
+        <w:rPr>
+          <w:rFonts w:ascii="Times New Roman" w:eastAsia="Times New Roman" w:hAnsi="Times New Roman" w:cs="Times New Roman"/>
+          <w:kern w:val="0"/>
+          <w:lang w:eastAsia="pt-BR"/>
+          <w14:ligatures w14:val="none"/>
+        </w:rPr>
+      </w:pPr>
+      <w:r>
+        <w:rPr>
+          <w:rFonts w:ascii="Times New Roman" w:eastAsia="Times New Roman" w:hAnsi="Times New Roman" w:cs="Times New Roman"/>
+          <w:kern w:val="0"/>
+          <w:lang w:eastAsia="pt-BR"/>
+          <w14:ligatures w14:val="none"/>
+        </w:rPr>
+        <w:t>Produtor:</w:t>
+      </w:r>
+    </w:p>
+    <w:p>
+      <w:pPr>
+        <w:spacing w:before="100" w:beforeAutospacing="1" w:after="100" w:afterAutospacing="1" w:line="240" w:lineRule="auto"/>
+        <w:rPr>
+          <w:rFonts w:ascii="Times New Roman" w:eastAsia="Times New Roman" w:hAnsi="Times New Roman" w:cs="Times New Roman"/>
+          <w:kern w:val="0"/>
+          <w:lang w:eastAsia="pt-BR"/>
+          <w14:ligatures w14:val="none"/>
+        </w:rPr>
+      </w:pPr>
+      <w:r>
+        <w:rPr>
+          <w:rFonts w:ascii="Times New Roman" w:eastAsia="Times New Roman" w:hAnsi="Times New Roman" w:cs="Times New Roman"/>
+          <w:kern w:val="0"/>
+          <w:lang w:eastAsia="pt-BR"/>
+          <w14:ligatures w14:val="none"/>
+        </w:rPr>
+        <w:t>Calma, robô! Primeiro, seja bem-vindo à fazenda. Depois quero ver se você é bom de serviço mesmo!</w:t>
+      </w:r>
+    </w:p>
+    <w:p>
+      <w:pPr>
+        <w:spacing w:before="100" w:beforeAutospacing="1" w:after="100" w:afterAutospacing="1" w:line="240" w:lineRule="auto"/>
+        <w:rPr>
+          <w:rFonts w:ascii="Times New Roman" w:eastAsia="Times New Roman" w:hAnsi="Times New Roman" w:cs="Times New Roman"/>
+          <w:kern w:val="0"/>
+          <w:lang w:eastAsia="pt-BR"/>
+          <w14:ligatures w14:val="none"/>
+        </w:rPr>
+      </w:pPr>
+      <w:proofErr w:type="spellStart"/>
+      <w:r>
+        <w:rPr>
+          <w:rFonts w:ascii="Times New Roman" w:eastAsia="Times New Roman" w:hAnsi="Times New Roman" w:cs="Times New Roman"/>
+          <w:kern w:val="0"/>
+          <w:lang w:eastAsia="pt-BR"/>
+          <w14:ligatures w14:val="none"/>
+        </w:rPr>
+        <w:t>Agrobot</w:t>
+      </w:r>
+      <w:proofErr w:type="spellEnd"/>
+      <w:r>
+        <w:rPr>
+          <w:rFonts w:ascii="Times New Roman" w:eastAsia="Times New Roman" w:hAnsi="Times New Roman" w:cs="Times New Roman"/>
+          <w:kern w:val="0"/>
+          <w:lang w:eastAsia="pt-BR"/>
+          <w14:ligatures w14:val="none"/>
+        </w:rPr>
+        <w:t>:</w:t>
+      </w:r>
+    </w:p>
+    <w:p>
+      <w:pPr>
+        <w:spacing w:before="100" w:beforeAutospacing="1" w:after="100" w:afterAutospacing="1" w:line="240" w:lineRule="auto"/>
+        <w:rPr>
+          <w:rFonts w:ascii="Times New Roman" w:eastAsia="Times New Roman" w:hAnsi="Times New Roman" w:cs="Times New Roman"/>
+          <w:kern w:val="0"/>
+          <w:lang w:eastAsia="pt-BR"/>
+          <w14:ligatures w14:val="none"/>
+        </w:rPr>
+      </w:pPr>
+      <w:r>
+        <w:rPr>
+          <w:rFonts w:ascii="Times New Roman" w:eastAsia="Times New Roman" w:hAnsi="Times New Roman" w:cs="Times New Roman"/>
+          <w:kern w:val="0"/>
+          <w:lang w:eastAsia="pt-BR"/>
+          <w14:ligatures w14:val="none"/>
+        </w:rPr>
+        <w:t>Pode deixar, chefe! Minha inteligência artificial está pronta. Agora, que tal me mostrar a fazenda?</w:t>
+      </w:r>
+    </w:p>
+    <w:p>
+      <w:pPr>
+        <w:spacing w:before="100" w:beforeAutospacing="1" w:after="100" w:afterAutospacing="1" w:line="240" w:lineRule="auto"/>
+        <w:rPr>
+          <w:rFonts w:ascii="Times New Roman" w:eastAsia="Times New Roman" w:hAnsi="Times New Roman" w:cs="Times New Roman"/>
+          <w:kern w:val="0"/>
+          <w:lang w:eastAsia="pt-BR"/>
+          <w14:ligatures w14:val="none"/>
+        </w:rPr>
+      </w:pPr>
+      <w:r>
+        <w:rPr>
+          <w:rFonts w:ascii="Times New Roman" w:eastAsia="Times New Roman" w:hAnsi="Times New Roman" w:cs="Times New Roman"/>
+          <w:kern w:val="0"/>
+          <w:lang w:eastAsia="pt-BR"/>
+          <w14:ligatures w14:val="none"/>
+        </w:rPr>
+        <w:t>Produtor:</w:t>
+      </w:r>
+    </w:p>
+    <w:p>
+      <w:pPr>
+        <w:spacing w:before="100" w:beforeAutospacing="1" w:after="100" w:afterAutospacing="1" w:line="240" w:lineRule="auto"/>
+        <w:rPr>
+          <w:rFonts w:ascii="Times New Roman" w:eastAsia="Times New Roman" w:hAnsi="Times New Roman" w:cs="Times New Roman"/>
+          <w:kern w:val="0"/>
+          <w:lang w:eastAsia="pt-BR"/>
+          <w14:ligatures w14:val="none"/>
+        </w:rPr>
+      </w:pPr>
+      <w:r>
+        <w:rPr>
+          <w:rFonts w:ascii="Times New Roman" w:eastAsia="Times New Roman" w:hAnsi="Times New Roman" w:cs="Times New Roman"/>
+          <w:kern w:val="0"/>
+          <w:lang w:eastAsia="pt-BR"/>
+          <w14:ligatures w14:val="none"/>
+        </w:rPr>
+        <w:lastRenderedPageBreak/>
+        <w:t>Vamos começar por aqui. Esta é a minha fazenda! Temos muito trabalho pela frente, e espero que você me ajude a cuidar de tudo por aqui.</w:t>
+      </w:r>
+    </w:p>
+    <w:p>
+      <w:pPr>
+        <w:spacing w:before="100" w:beforeAutospacing="1" w:after="100" w:afterAutospacing="1" w:line="240" w:lineRule="auto"/>
+        <w:rPr>
+          <w:rFonts w:ascii="Times New Roman" w:eastAsia="Times New Roman" w:hAnsi="Times New Roman" w:cs="Times New Roman"/>
+          <w:kern w:val="0"/>
+          <w:lang w:eastAsia="pt-BR"/>
+          <w14:ligatures w14:val="none"/>
+        </w:rPr>
+      </w:pPr>
+      <w:proofErr w:type="spellStart"/>
+      <w:r>
+        <w:rPr>
+          <w:rFonts w:ascii="Times New Roman" w:eastAsia="Times New Roman" w:hAnsi="Times New Roman" w:cs="Times New Roman"/>
+          <w:kern w:val="0"/>
+          <w:lang w:eastAsia="pt-BR"/>
+          <w14:ligatures w14:val="none"/>
+        </w:rPr>
+        <w:t>Agrobot</w:t>
+      </w:r>
+      <w:proofErr w:type="spellEnd"/>
+      <w:r>
+        <w:rPr>
+          <w:rFonts w:ascii="Times New Roman" w:eastAsia="Times New Roman" w:hAnsi="Times New Roman" w:cs="Times New Roman"/>
+          <w:kern w:val="0"/>
+          <w:lang w:eastAsia="pt-BR"/>
+          <w14:ligatures w14:val="none"/>
+        </w:rPr>
+        <w:t>:</w:t>
+      </w:r>
+    </w:p>
+    <w:p>
+      <w:pPr>
+        <w:spacing w:before="100" w:beforeAutospacing="1" w:after="100" w:afterAutospacing="1" w:line="240" w:lineRule="auto"/>
+        <w:rPr>
+          <w:rFonts w:ascii="Times New Roman" w:eastAsia="Times New Roman" w:hAnsi="Times New Roman" w:cs="Times New Roman"/>
+          <w:kern w:val="0"/>
+          <w:lang w:eastAsia="pt-BR"/>
+          <w14:ligatures w14:val="none"/>
+        </w:rPr>
+      </w:pPr>
+      <w:r>
+        <w:rPr>
+          <w:rFonts w:ascii="Times New Roman" w:eastAsia="Times New Roman" w:hAnsi="Times New Roman" w:cs="Times New Roman"/>
+          <w:kern w:val="0"/>
+          <w:lang w:eastAsia="pt-BR"/>
+          <w14:ligatures w14:val="none"/>
+        </w:rPr>
+        <w:t>Fazenda identificada, chefe! Que tal começarmos com uma inspeção? Assim, vou conhecer a área e descobrir onde posso ser mais útil.</w:t>
+      </w:r>
+    </w:p>
+    <w:p>
+      <w:pPr>
+        <w:spacing w:before="100" w:beforeAutospacing="1" w:after="100" w:afterAutospacing="1" w:line="240" w:lineRule="auto"/>
+        <w:rPr>
+          <w:rFonts w:ascii="Times New Roman" w:eastAsia="Times New Roman" w:hAnsi="Times New Roman" w:cs="Times New Roman"/>
+          <w:kern w:val="0"/>
+          <w:lang w:eastAsia="pt-BR"/>
+          <w14:ligatures w14:val="none"/>
+        </w:rPr>
+      </w:pPr>
+      <w:proofErr w:type="spellStart"/>
+      <w:r>
+        <w:rPr>
+          <w:rFonts w:ascii="Times New Roman" w:eastAsia="Times New Roman" w:hAnsi="Times New Roman" w:cs="Times New Roman"/>
+          <w:kern w:val="0"/>
+          <w:lang w:eastAsia="pt-BR"/>
+          <w14:ligatures w14:val="none"/>
+        </w:rPr>
+        <w:t>Agrobot</w:t>
+      </w:r>
+      <w:proofErr w:type="spellEnd"/>
+      <w:r>
+        <w:rPr>
+          <w:rFonts w:ascii="Times New Roman" w:eastAsia="Times New Roman" w:hAnsi="Times New Roman" w:cs="Times New Roman"/>
+          <w:kern w:val="0"/>
+          <w:lang w:eastAsia="pt-BR"/>
+          <w14:ligatures w14:val="none"/>
+        </w:rPr>
+        <w:t>:</w:t>
+      </w:r>
+    </w:p>
+    <w:p>
+      <w:pPr>
+        <w:spacing w:before="100" w:beforeAutospacing="1" w:after="100" w:afterAutospacing="1" w:line="240" w:lineRule="auto"/>
+        <w:rPr>
+          <w:rFonts w:ascii="Times New Roman" w:eastAsia="Times New Roman" w:hAnsi="Times New Roman" w:cs="Times New Roman"/>
+          <w:kern w:val="0"/>
+          <w:lang w:eastAsia="pt-BR"/>
+          <w14:ligatures w14:val="none"/>
+        </w:rPr>
+      </w:pPr>
+      <w:r>
+        <w:rPr>
+          <w:rFonts w:ascii="Times New Roman" w:eastAsia="Times New Roman" w:hAnsi="Times New Roman" w:cs="Times New Roman"/>
+          <w:kern w:val="0"/>
+          <w:lang w:eastAsia="pt-BR"/>
+          <w14:ligatures w14:val="none"/>
+        </w:rPr>
+        <w:t>Detectei um parque solar aqui na fazenda! Estou identificando vários painéis fotovoltaicos que transformam a luz do sol em energia elétrica. Essa é uma ótima forma de aproveitar uma fonte de energia limpa e renovável. Tecnologia e sustentabilidade trabalhando juntas!</w:t>
+      </w:r>
+    </w:p>
+    <w:p>
+      <w:pPr>
+        <w:spacing w:before="100" w:beforeAutospacing="1" w:after="100" w:afterAutospacing="1" w:line="240" w:lineRule="auto"/>
+        <w:rPr>
+          <w:rFonts w:ascii="Times New Roman" w:eastAsia="Times New Roman" w:hAnsi="Times New Roman" w:cs="Times New Roman"/>
+          <w:kern w:val="0"/>
+          <w:lang w:eastAsia="pt-BR"/>
+          <w14:ligatures w14:val="none"/>
+        </w:rPr>
+      </w:pPr>
+    </w:p>
+    <w:p>
+      <w:pPr>
+        <w:spacing w:before="100" w:beforeAutospacing="1" w:after="100" w:afterAutospacing="1" w:line="240" w:lineRule="auto"/>
+        <w:rPr>
+          <w:rFonts w:ascii="Times New Roman" w:eastAsia="Times New Roman" w:hAnsi="Times New Roman" w:cs="Times New Roman"/>
+          <w:kern w:val="0"/>
+          <w:lang w:eastAsia="pt-BR"/>
+          <w14:ligatures w14:val="none"/>
+        </w:rPr>
+      </w:pPr>
+      <w:proofErr w:type="spellStart"/>
+      <w:r>
+        <w:rPr>
+          <w:rFonts w:ascii="Times New Roman" w:eastAsia="Times New Roman" w:hAnsi="Times New Roman" w:cs="Times New Roman"/>
+          <w:kern w:val="0"/>
+          <w:lang w:eastAsia="pt-BR"/>
+          <w14:ligatures w14:val="none"/>
+        </w:rPr>
+        <w:t>Agrobot</w:t>
+      </w:r>
+      <w:proofErr w:type="spellEnd"/>
+      <w:r>
+        <w:rPr>
+          <w:rFonts w:ascii="Times New Roman" w:eastAsia="Times New Roman" w:hAnsi="Times New Roman" w:cs="Times New Roman"/>
+          <w:kern w:val="0"/>
+          <w:lang w:eastAsia="pt-BR"/>
+          <w14:ligatures w14:val="none"/>
+        </w:rPr>
+        <w:t>:</w:t>
+      </w:r>
+    </w:p>
+    <w:p>
+      <w:pPr>
+        <w:spacing w:before="100" w:beforeAutospacing="1" w:after="100" w:afterAutospacing="1" w:line="240" w:lineRule="auto"/>
+        <w:rPr>
+          <w:rFonts w:ascii="Times New Roman" w:eastAsia="Times New Roman" w:hAnsi="Times New Roman" w:cs="Times New Roman"/>
+          <w:kern w:val="0"/>
+          <w:lang w:eastAsia="pt-BR"/>
+          <w14:ligatures w14:val="none"/>
+        </w:rPr>
+      </w:pPr>
+      <w:r>
+        <w:rPr>
+          <w:rFonts w:ascii="Times New Roman" w:eastAsia="Times New Roman" w:hAnsi="Times New Roman" w:cs="Times New Roman"/>
+          <w:kern w:val="0"/>
+          <w:lang w:eastAsia="pt-BR"/>
+          <w14:ligatures w14:val="none"/>
+        </w:rPr>
+        <w:t>O</w:t>
+      </w:r>
+      <w:r>
+        <w:rPr>
+          <w:rFonts w:ascii="Times New Roman" w:eastAsia="Times New Roman" w:hAnsi="Times New Roman" w:cs="Times New Roman"/>
+          <w:kern w:val="0"/>
+          <w:lang w:eastAsia="pt-BR"/>
+          <w14:ligatures w14:val="none"/>
+        </w:rPr>
+        <w:t>lha só o que encontrei! Um parque eólico! Essas turbinas aproveitam a força dos ventos para gerar energia elétrica, sem precisar queimar combustíveis. É impressionante como podemos aproveitar os recursos da natureza para produzir energia limpa. Essa fazenda está ficando cada vez mais tecnológica!</w:t>
+      </w:r>
+    </w:p>
+    <w:p>
+      <w:pPr>
+        <w:spacing w:before="100" w:beforeAutospacing="1" w:after="100" w:afterAutospacing="1" w:line="240" w:lineRule="auto"/>
+        <w:outlineLvl w:val="1"/>
         <w:rPr>
           <w:rFonts w:ascii="Times New Roman" w:eastAsia="Times New Roman" w:hAnsi="Times New Roman" w:cs="Times New Roman"/>
           <w:b/>
@@ -350,7 +690,32 @@
           <w:lang w:eastAsia="pt-BR"/>
           <w14:ligatures w14:val="none"/>
         </w:rPr>
-        <w:t>2</w:t>
+      </w:pPr>
+      <w:r>
+        <w:rPr>
+          <w:rFonts w:ascii="Times New Roman" w:eastAsia="Times New Roman" w:hAnsi="Times New Roman" w:cs="Times New Roman"/>
+          <w:b/>
+          <w:bCs/>
+          <w:kern w:val="0"/>
+          <w:sz w:val="36"/>
+          <w:szCs w:val="36"/>
+          <w:lang w:eastAsia="pt-BR"/>
+          <w14:ligatures w14:val="none"/>
+        </w:rPr>
+        <w:t xml:space="preserve">Missão 3: Plantio de Milho </w:t>
+      </w:r>
+      <w:r>
+        <w:rPr>
+          <w:rFonts w:ascii="Segoe UI Emoji" w:eastAsia="Times New Roman" w:hAnsi="Segoe UI Emoji" w:cs="Segoe UI Emoji"/>
+          <w:b/>
+          <w:bCs/>
+          <w:kern w:val="0"/>
+          <w:sz w:val="36"/>
+          <w:szCs w:val="36"/>
+          <w:lang w:eastAsia="pt-BR"/>
+          <w14:ligatures w14:val="none"/>
+        </w:rPr>
+        <w:t>🌽</w:t>
       </w:r>
     </w:p>
     <w:p>
@@ -383,54 +748,76 @@
           <w14:ligatures w14:val="none"/>
         </w:rPr>
       </w:pPr>
-      <w:r>
-        <w:rPr>
-          <w:rFonts w:ascii="Times New Roman" w:eastAsia="Times New Roman" w:hAnsi="Times New Roman" w:cs="Times New Roman"/>
-          <w:kern w:val="0"/>
-          <w:lang w:eastAsia="pt-BR"/>
-          <w14:ligatures w14:val="none"/>
-        </w:rPr>
-        <w:t>Calma, robô! Primeiro, seja bem-vindo à fazenda. Depois quero ver se você é bom de serviço mesmo!</w:t>
-      </w:r>
-    </w:p>
-    <w:p>
-      <w:pPr>
-        <w:spacing w:before="100" w:beforeAutospacing="1" w:after="100" w:afterAutospacing="1" w:line="240" w:lineRule="auto"/>
-        <w:rPr>
-          <w:rFonts w:ascii="Times New Roman" w:eastAsia="Times New Roman" w:hAnsi="Times New Roman" w:cs="Times New Roman"/>
-          <w:kern w:val="0"/>
-          <w:lang w:eastAsia="pt-BR"/>
-          <w14:ligatures w14:val="none"/>
-        </w:rPr>
-      </w:pPr>
-      <w:r>
-        <w:rPr>
-          <w:rFonts w:ascii="Times New Roman" w:eastAsia="Times New Roman" w:hAnsi="Times New Roman" w:cs="Times New Roman"/>
-          <w:kern w:val="0"/>
-          <w:lang w:eastAsia="pt-BR"/>
-          <w14:ligatures w14:val="none"/>
-        </w:rPr>
-        <w:t>Agrobot:</w:t>
-      </w:r>
-    </w:p>
-    <w:p>
-      <w:pPr>
-        <w:spacing w:before="100" w:beforeAutospacing="1" w:after="100" w:afterAutospacing="1" w:line="240" w:lineRule="auto"/>
-        <w:rPr>
-          <w:rFonts w:ascii="Times New Roman" w:eastAsia="Times New Roman" w:hAnsi="Times New Roman" w:cs="Times New Roman"/>
-          <w:kern w:val="0"/>
-          <w:lang w:eastAsia="pt-BR"/>
-          <w14:ligatures w14:val="none"/>
-        </w:rPr>
-      </w:pPr>
-      <w:r>
-        <w:rPr>
-          <w:rFonts w:ascii="Times New Roman" w:eastAsia="Times New Roman" w:hAnsi="Times New Roman" w:cs="Times New Roman"/>
-          <w:kern w:val="0"/>
-          <w:lang w:eastAsia="pt-BR"/>
-          <w14:ligatures w14:val="none"/>
-        </w:rPr>
-        <w:t>Pode deixar, chefe! Minha inteligência artificial está pronta. Agora, que tal me mostrar a fazenda?</w:t>
+      <w:proofErr w:type="spellStart"/>
+      <w:r>
+        <w:rPr>
+          <w:rFonts w:ascii="Times New Roman" w:eastAsia="Times New Roman" w:hAnsi="Times New Roman" w:cs="Times New Roman"/>
+          <w:kern w:val="0"/>
+          <w:lang w:eastAsia="pt-BR"/>
+          <w14:ligatures w14:val="none"/>
+        </w:rPr>
+        <w:t>Agrobot</w:t>
+      </w:r>
+      <w:proofErr w:type="spellEnd"/>
+      <w:r>
+        <w:rPr>
+          <w:rFonts w:ascii="Times New Roman" w:eastAsia="Times New Roman" w:hAnsi="Times New Roman" w:cs="Times New Roman"/>
+          <w:kern w:val="0"/>
+          <w:lang w:eastAsia="pt-BR"/>
+          <w14:ligatures w14:val="none"/>
+        </w:rPr>
+        <w:t>, já que você conheceu um pouco da fazenda, vamos partir para o trabalho! Temos uma área preparada para o plantio de milho.</w:t>
+      </w:r>
+    </w:p>
+    <w:p>
+      <w:pPr>
+        <w:spacing w:before="100" w:beforeAutospacing="1" w:after="100" w:afterAutospacing="1" w:line="240" w:lineRule="auto"/>
+        <w:rPr>
+          <w:rFonts w:ascii="Times New Roman" w:eastAsia="Times New Roman" w:hAnsi="Times New Roman" w:cs="Times New Roman"/>
+          <w:kern w:val="0"/>
+          <w:lang w:eastAsia="pt-BR"/>
+          <w14:ligatures w14:val="none"/>
+        </w:rPr>
+      </w:pPr>
+      <w:proofErr w:type="spellStart"/>
+      <w:r>
+        <w:rPr>
+          <w:rFonts w:ascii="Times New Roman" w:eastAsia="Times New Roman" w:hAnsi="Times New Roman" w:cs="Times New Roman"/>
+          <w:kern w:val="0"/>
+          <w:lang w:eastAsia="pt-BR"/>
+          <w14:ligatures w14:val="none"/>
+        </w:rPr>
+        <w:t>Agrobot</w:t>
+      </w:r>
+      <w:proofErr w:type="spellEnd"/>
+      <w:r>
+        <w:rPr>
+          <w:rFonts w:ascii="Times New Roman" w:eastAsia="Times New Roman" w:hAnsi="Times New Roman" w:cs="Times New Roman"/>
+          <w:kern w:val="0"/>
+          <w:lang w:eastAsia="pt-BR"/>
+          <w14:ligatures w14:val="none"/>
+        </w:rPr>
+        <w:t>:</w:t>
+      </w:r>
+    </w:p>
+    <w:p>
+      <w:pPr>
+        <w:spacing w:before="100" w:beforeAutospacing="1" w:after="100" w:afterAutospacing="1" w:line="240" w:lineRule="auto"/>
+        <w:rPr>
+          <w:rFonts w:ascii="Times New Roman" w:eastAsia="Times New Roman" w:hAnsi="Times New Roman" w:cs="Times New Roman"/>
+          <w:kern w:val="0"/>
+          <w:lang w:eastAsia="pt-BR"/>
+          <w14:ligatures w14:val="none"/>
+        </w:rPr>
+      </w:pPr>
+      <w:r>
+        <w:rPr>
+          <w:rFonts w:ascii="Times New Roman" w:eastAsia="Times New Roman" w:hAnsi="Times New Roman" w:cs="Times New Roman"/>
+          <w:kern w:val="0"/>
+          <w:lang w:eastAsia="pt-BR"/>
+          <w14:ligatures w14:val="none"/>
+        </w:rPr>
+        <w:t>Entendido, chefe! O milho é uma cultura muito importante para a produção agrícola. Vamos preparar a área e iniciar o plantio!</w:t>
       </w:r>
     </w:p>
     <w:p>
@@ -470,149 +857,122 @@
           <w:lang w:eastAsia="pt-BR"/>
           <w14:ligatures w14:val="none"/>
         </w:rPr>
+        <w:t>Isso mesmo! Precisamos fazer tudo direitinho para garantir um bom desenvolvimento da lavoura. Vamos colocar a mão na massa!</w:t>
+      </w:r>
+    </w:p>
+    <w:p>
+      <w:pPr>
+        <w:spacing w:before="100" w:beforeAutospacing="1" w:after="100" w:afterAutospacing="1" w:line="240" w:lineRule="auto"/>
+        <w:rPr>
+          <w:rFonts w:ascii="Times New Roman" w:eastAsia="Times New Roman" w:hAnsi="Times New Roman" w:cs="Times New Roman"/>
+          <w:kern w:val="0"/>
+          <w:lang w:eastAsia="pt-BR"/>
+          <w14:ligatures w14:val="none"/>
+        </w:rPr>
+      </w:pPr>
+      <w:proofErr w:type="spellStart"/>
+      <w:r>
+        <w:rPr>
+          <w:rFonts w:ascii="Times New Roman" w:eastAsia="Times New Roman" w:hAnsi="Times New Roman" w:cs="Times New Roman"/>
+          <w:kern w:val="0"/>
+          <w:lang w:eastAsia="pt-BR"/>
+          <w14:ligatures w14:val="none"/>
+        </w:rPr>
+        <w:t>Agrobot</w:t>
+      </w:r>
+      <w:proofErr w:type="spellEnd"/>
+      <w:r>
+        <w:rPr>
+          <w:rFonts w:ascii="Times New Roman" w:eastAsia="Times New Roman" w:hAnsi="Times New Roman" w:cs="Times New Roman"/>
+          <w:kern w:val="0"/>
+          <w:lang w:eastAsia="pt-BR"/>
+          <w14:ligatures w14:val="none"/>
+        </w:rPr>
+        <w:t>:</w:t>
+      </w:r>
+    </w:p>
+    <w:p>
+      <w:pPr>
+        <w:spacing w:before="100" w:beforeAutospacing="1" w:after="100" w:afterAutospacing="1" w:line="240" w:lineRule="auto"/>
+        <w:rPr>
+          <w:rFonts w:ascii="Times New Roman" w:eastAsia="Times New Roman" w:hAnsi="Times New Roman" w:cs="Times New Roman"/>
+          <w:kern w:val="0"/>
+          <w:lang w:eastAsia="pt-BR"/>
+          <w14:ligatures w14:val="none"/>
+        </w:rPr>
+      </w:pPr>
+      <w:r>
+        <w:rPr>
+          <w:rFonts w:ascii="Times New Roman" w:eastAsia="Times New Roman" w:hAnsi="Times New Roman" w:cs="Times New Roman"/>
+          <w:kern w:val="0"/>
+          <w:lang w:eastAsia="pt-BR"/>
+          <w14:ligatures w14:val="none"/>
+        </w:rPr>
+        <w:t>Área de plantio identificada! Estou pronto para ajudar no plantio do milho. Com tecnologia e planejamento, vamos dar o primeiro passo para uma boa colheita!</w:t>
+      </w:r>
+    </w:p>
+    <w:p>
+      <w:pPr>
+        <w:spacing w:before="100" w:beforeAutospacing="1" w:after="100" w:afterAutospacing="1" w:line="240" w:lineRule="auto"/>
+        <w:rPr>
+          <w:rFonts w:ascii="Times New Roman" w:eastAsia="Times New Roman" w:hAnsi="Times New Roman" w:cs="Times New Roman"/>
+          <w:kern w:val="0"/>
+          <w:lang w:eastAsia="pt-BR"/>
+          <w14:ligatures w14:val="none"/>
+        </w:rPr>
+      </w:pPr>
+      <w:r>
+        <w:rPr>
+          <w:rFonts w:ascii="Times New Roman" w:eastAsia="Times New Roman" w:hAnsi="Times New Roman" w:cs="Times New Roman"/>
+          <w:kern w:val="0"/>
+          <w:lang w:eastAsia="pt-BR"/>
+          <w14:ligatures w14:val="none"/>
+        </w:rPr>
+        <w:t>Produtor:</w:t>
+      </w:r>
+    </w:p>
+    <w:p>
+      <w:pPr>
+        <w:spacing w:before="100" w:beforeAutospacing="1" w:after="100" w:afterAutospacing="1" w:line="240" w:lineRule="auto"/>
+        <w:rPr>
+          <w:rFonts w:ascii="Times New Roman" w:eastAsia="Times New Roman" w:hAnsi="Times New Roman" w:cs="Times New Roman"/>
+          <w:kern w:val="0"/>
+          <w:lang w:eastAsia="pt-BR"/>
+          <w14:ligatures w14:val="none"/>
+        </w:rPr>
+      </w:pPr>
+      <w:r>
+        <w:rPr>
+          <w:rFonts w:ascii="Times New Roman" w:eastAsia="Times New Roman" w:hAnsi="Times New Roman" w:cs="Times New Roman"/>
+          <w:kern w:val="0"/>
+          <w:lang w:eastAsia="pt-BR"/>
+          <w14:ligatures w14:val="none"/>
+        </w:rPr>
         <w:lastRenderedPageBreak/>
-        <w:t>Vamos começar por aqui. Esta é a minha fazenda! Temos muito trabalho pela frente, e espero que você me ajude a cuidar de tudo por aqui.</w:t>
-      </w:r>
-    </w:p>
-    <w:p>
-      <w:pPr>
-        <w:spacing w:before="100" w:beforeAutospacing="1" w:after="100" w:afterAutospacing="1" w:line="240" w:lineRule="auto"/>
-        <w:rPr>
-          <w:rFonts w:ascii="Times New Roman" w:eastAsia="Times New Roman" w:hAnsi="Times New Roman" w:cs="Times New Roman"/>
-          <w:kern w:val="0"/>
-          <w:lang w:eastAsia="pt-BR"/>
-          <w14:ligatures w14:val="none"/>
-        </w:rPr>
-      </w:pPr>
-      <w:r>
-        <w:rPr>
-          <w:rFonts w:ascii="Times New Roman" w:eastAsia="Times New Roman" w:hAnsi="Times New Roman" w:cs="Times New Roman"/>
-          <w:kern w:val="0"/>
-          <w:lang w:eastAsia="pt-BR"/>
-          <w14:ligatures w14:val="none"/>
-        </w:rPr>
-        <w:t>Agrobot:</w:t>
-      </w:r>
-    </w:p>
-    <w:p>
-      <w:pPr>
-        <w:spacing w:before="100" w:beforeAutospacing="1" w:after="100" w:afterAutospacing="1" w:line="240" w:lineRule="auto"/>
-        <w:rPr>
-          <w:rFonts w:ascii="Times New Roman" w:eastAsia="Times New Roman" w:hAnsi="Times New Roman" w:cs="Times New Roman"/>
-          <w:kern w:val="0"/>
-          <w:lang w:eastAsia="pt-BR"/>
-          <w14:ligatures w14:val="none"/>
-        </w:rPr>
-      </w:pPr>
-      <w:r>
-        <w:rPr>
-          <w:rFonts w:ascii="Times New Roman" w:eastAsia="Times New Roman" w:hAnsi="Times New Roman" w:cs="Times New Roman"/>
-          <w:kern w:val="0"/>
-          <w:lang w:eastAsia="pt-BR"/>
-          <w14:ligatures w14:val="none"/>
-        </w:rPr>
-        <w:t>Fazenda identificada, chefe! Que tal começarmos com uma inspeção? Assim, vou conhecer a área e descobrir onde posso ser mais útil.</w:t>
-      </w:r>
-    </w:p>
-    <w:p>
-      <w:pPr>
-        <w:spacing w:before="100" w:beforeAutospacing="1" w:after="100" w:afterAutospacing="1" w:line="240" w:lineRule="auto"/>
-        <w:rPr>
-          <w:rFonts w:ascii="Times New Roman" w:eastAsia="Times New Roman" w:hAnsi="Times New Roman" w:cs="Times New Roman"/>
-          <w:kern w:val="0"/>
-          <w:lang w:eastAsia="pt-BR"/>
-          <w14:ligatures w14:val="none"/>
-        </w:rPr>
-      </w:pPr>
-      <w:r>
-        <w:rPr>
-          <w:rFonts w:ascii="Times New Roman" w:eastAsia="Times New Roman" w:hAnsi="Times New Roman" w:cs="Times New Roman"/>
-          <w:kern w:val="0"/>
-          <w:lang w:eastAsia="pt-BR"/>
-          <w14:ligatures w14:val="none"/>
-        </w:rPr>
-        <w:t>Agrobot:</w:t>
-      </w:r>
-    </w:p>
-    <w:p>
-      <w:pPr>
-        <w:spacing w:before="100" w:beforeAutospacing="1" w:after="100" w:afterAutospacing="1" w:line="240" w:lineRule="auto"/>
-        <w:rPr>
-          <w:rFonts w:ascii="Times New Roman" w:eastAsia="Times New Roman" w:hAnsi="Times New Roman" w:cs="Times New Roman"/>
-          <w:kern w:val="0"/>
-          <w:lang w:eastAsia="pt-BR"/>
-          <w14:ligatures w14:val="none"/>
-        </w:rPr>
-      </w:pPr>
-      <w:r>
-        <w:rPr>
-          <w:rFonts w:ascii="Times New Roman" w:eastAsia="Times New Roman" w:hAnsi="Times New Roman" w:cs="Times New Roman"/>
-          <w:kern w:val="0"/>
-          <w:lang w:eastAsia="pt-BR"/>
-          <w14:ligatures w14:val="none"/>
-        </w:rPr>
-        <w:t>Detectei um parque solar aqui na fazenda! Estou identificando vários painéis fotovoltaicos que transformam a luz do sol em energia elétrica. Essa é uma ótima forma de aproveitar uma fonte de energia limpa e renovável. Tecnologia e sustentabilidade trabalhando juntas!</w:t>
-      </w:r>
-    </w:p>
-    <w:p>
-      <w:pPr>
-        <w:spacing w:before="100" w:beforeAutospacing="1" w:after="100" w:afterAutospacing="1" w:line="240" w:lineRule="auto"/>
-        <w:rPr>
-          <w:rFonts w:ascii="Times New Roman" w:eastAsia="Times New Roman" w:hAnsi="Times New Roman" w:cs="Times New Roman"/>
-          <w:kern w:val="0"/>
-          <w:lang w:eastAsia="pt-BR"/>
-          <w14:ligatures w14:val="none"/>
-        </w:rPr>
-      </w:pPr>
-    </w:p>
-    <w:p>
-      <w:pPr>
-        <w:spacing w:before="100" w:beforeAutospacing="1" w:after="100" w:afterAutospacing="1" w:line="240" w:lineRule="auto"/>
-        <w:rPr>
-          <w:rFonts w:ascii="Times New Roman" w:eastAsia="Times New Roman" w:hAnsi="Times New Roman" w:cs="Times New Roman"/>
-          <w:kern w:val="0"/>
-          <w:lang w:eastAsia="pt-BR"/>
-          <w14:ligatures w14:val="none"/>
-        </w:rPr>
-      </w:pPr>
-      <w:r>
-        <w:rPr>
-          <w:rFonts w:ascii="Times New Roman" w:eastAsia="Times New Roman" w:hAnsi="Times New Roman" w:cs="Times New Roman"/>
-          <w:kern w:val="0"/>
-          <w:lang w:eastAsia="pt-BR"/>
-          <w14:ligatures w14:val="none"/>
-        </w:rPr>
-        <w:t>Agrobot:</w:t>
-      </w:r>
-    </w:p>
-    <w:p>
-      <w:pPr>
-        <w:spacing w:before="100" w:beforeAutospacing="1" w:after="100" w:afterAutospacing="1" w:line="240" w:lineRule="auto"/>
-        <w:rPr>
-          <w:rFonts w:ascii="Times New Roman" w:eastAsia="Times New Roman" w:hAnsi="Times New Roman" w:cs="Times New Roman"/>
-          <w:kern w:val="0"/>
-          <w:lang w:eastAsia="pt-BR"/>
-          <w14:ligatures w14:val="none"/>
-        </w:rPr>
-      </w:pPr>
-      <w:r>
-        <w:rPr>
-          <w:rFonts w:ascii="Times New Roman" w:eastAsia="Times New Roman" w:hAnsi="Times New Roman" w:cs="Times New Roman"/>
-          <w:kern w:val="0"/>
-          <w:lang w:eastAsia="pt-BR"/>
-          <w14:ligatures w14:val="none"/>
-        </w:rPr>
-        <w:t>O</w:t>
-      </w:r>
-      <w:r>
-        <w:rPr>
-          <w:rFonts w:ascii="Times New Roman" w:eastAsia="Times New Roman" w:hAnsi="Times New Roman" w:cs="Times New Roman"/>
-          <w:kern w:val="0"/>
-          <w:lang w:eastAsia="pt-BR"/>
-          <w14:ligatures w14:val="none"/>
-        </w:rPr>
-        <w:t>lha só o que encontrei! Um parque eólico! Essas turbinas aproveitam a força dos ventos para gerar energia elétrica, sem precisar queimar combustíveis. É impressionante como podemos aproveitar os recursos da natureza para produzir energia limpa. Essa fazenda está ficando cada vez mais tecnológica!</w:t>
-      </w:r>
+        <w:t>Muito bem! Vamos começar o plantio e acompanhar o desenvolvimento da nossa lavoura. Quero ver essa área toda verdinha!</w:t>
+      </w:r>
+    </w:p>
+    <w:p>
+      <w:pPr>
+        <w:spacing w:before="100" w:beforeAutospacing="1" w:after="100" w:afterAutospacing="1" w:line="240" w:lineRule="auto"/>
+        <w:rPr>
+          <w:rFonts w:ascii="Times New Roman" w:eastAsia="Times New Roman" w:hAnsi="Times New Roman" w:cs="Times New Roman"/>
+          <w:kern w:val="0"/>
+          <w:lang w:eastAsia="pt-BR"/>
+          <w14:ligatures w14:val="none"/>
+        </w:rPr>
+      </w:pPr>
+    </w:p>
+    <w:p>
+      <w:pPr>
+        <w:spacing w:before="100" w:beforeAutospacing="1" w:after="100" w:afterAutospacing="1" w:line="240" w:lineRule="auto"/>
+        <w:rPr>
+          <w:rFonts w:ascii="Times New Roman" w:eastAsia="Times New Roman" w:hAnsi="Times New Roman" w:cs="Times New Roman"/>
+          <w:kern w:val="0"/>
+          <w:lang w:eastAsia="pt-BR"/>
+          <w14:ligatures w14:val="none"/>
+        </w:rPr>
+      </w:pPr>
     </w:p>
     <w:p/>
     <w:sectPr>
@@ -1228,6 +1588,7 @@
   <w:style w:type="character" w:default="1" w:styleId="Fontepargpadro">
     <w:name w:val="Default Paragraph Font"/>
     <w:uiPriority w:val="1"/>
+    <w:semiHidden/>
     <w:unhideWhenUsed/>
   </w:style>
   <w:style w:type="table" w:default="1" w:styleId="Tabelanormal">

</xml_diff>

<commit_message>
missão 4: diálogos M4 player e agrobot
</commit_message>
<xml_diff>
--- a/Dialogos.docx
+++ b/Dialogos.docx
@@ -950,6 +950,430 @@
         </w:rPr>
         <w:lastRenderedPageBreak/>
         <w:t>Muito bem! Vamos começar o plantio e acompanhar o desenvolvimento da nossa lavoura. Quero ver essa área toda verdinha!</w:t>
+      </w:r>
+    </w:p>
+    <w:p>
+      <w:pPr>
+        <w:spacing w:before="100" w:beforeAutospacing="1" w:after="100" w:afterAutospacing="1" w:line="240" w:lineRule="auto"/>
+        <w:outlineLvl w:val="1"/>
+        <w:rPr>
+          <w:rFonts w:ascii="Times New Roman" w:eastAsia="Times New Roman" w:hAnsi="Times New Roman" w:cs="Times New Roman"/>
+          <w:b/>
+          <w:bCs/>
+          <w:kern w:val="0"/>
+          <w:sz w:val="36"/>
+          <w:szCs w:val="36"/>
+          <w:lang w:eastAsia="pt-BR"/>
+          <w14:ligatures w14:val="none"/>
+        </w:rPr>
+      </w:pPr>
+      <w:r>
+        <w:rPr>
+          <w:rFonts w:ascii="Times New Roman" w:eastAsia="Times New Roman" w:hAnsi="Times New Roman" w:cs="Times New Roman"/>
+          <w:b/>
+          <w:bCs/>
+          <w:kern w:val="0"/>
+          <w:sz w:val="36"/>
+          <w:szCs w:val="36"/>
+          <w:lang w:eastAsia="pt-BR"/>
+          <w14:ligatures w14:val="none"/>
+        </w:rPr>
+        <w:t xml:space="preserve">Missão 4: Pulverização Sustentável </w:t>
+      </w:r>
+      <w:r>
+        <w:rPr>
+          <w:rFonts w:ascii="Segoe UI Emoji" w:eastAsia="Times New Roman" w:hAnsi="Segoe UI Emoji" w:cs="Segoe UI Emoji"/>
+          <w:b/>
+          <w:bCs/>
+          <w:kern w:val="0"/>
+          <w:sz w:val="36"/>
+          <w:szCs w:val="36"/>
+          <w:lang w:eastAsia="pt-BR"/>
+          <w14:ligatures w14:val="none"/>
+        </w:rPr>
+        <w:t>🌽🚁</w:t>
+      </w:r>
+    </w:p>
+    <w:p>
+      <w:pPr>
+        <w:spacing w:before="100" w:beforeAutospacing="1" w:after="100" w:afterAutospacing="1" w:line="240" w:lineRule="auto"/>
+        <w:rPr>
+          <w:rFonts w:ascii="Times New Roman" w:eastAsia="Times New Roman" w:hAnsi="Times New Roman" w:cs="Times New Roman"/>
+          <w:kern w:val="0"/>
+          <w:lang w:eastAsia="pt-BR"/>
+          <w14:ligatures w14:val="none"/>
+        </w:rPr>
+      </w:pPr>
+      <w:r>
+        <w:rPr>
+          <w:rFonts w:ascii="Times New Roman" w:eastAsia="Times New Roman" w:hAnsi="Times New Roman" w:cs="Times New Roman"/>
+          <w:kern w:val="0"/>
+          <w:lang w:eastAsia="pt-BR"/>
+          <w14:ligatures w14:val="none"/>
+        </w:rPr>
+        <w:t>Produtor:</w:t>
+      </w:r>
+    </w:p>
+    <w:p>
+      <w:pPr>
+        <w:spacing w:before="100" w:beforeAutospacing="1" w:after="100" w:afterAutospacing="1" w:line="240" w:lineRule="auto"/>
+        <w:rPr>
+          <w:rFonts w:ascii="Times New Roman" w:eastAsia="Times New Roman" w:hAnsi="Times New Roman" w:cs="Times New Roman"/>
+          <w:kern w:val="0"/>
+          <w:lang w:eastAsia="pt-BR"/>
+          <w14:ligatures w14:val="none"/>
+        </w:rPr>
+      </w:pPr>
+      <w:proofErr w:type="spellStart"/>
+      <w:r>
+        <w:rPr>
+          <w:rFonts w:ascii="Times New Roman" w:eastAsia="Times New Roman" w:hAnsi="Times New Roman" w:cs="Times New Roman"/>
+          <w:kern w:val="0"/>
+          <w:lang w:eastAsia="pt-BR"/>
+          <w14:ligatures w14:val="none"/>
+        </w:rPr>
+        <w:t>Agrobot</w:t>
+      </w:r>
+      <w:proofErr w:type="spellEnd"/>
+      <w:r>
+        <w:rPr>
+          <w:rFonts w:ascii="Times New Roman" w:eastAsia="Times New Roman" w:hAnsi="Times New Roman" w:cs="Times New Roman"/>
+          <w:kern w:val="0"/>
+          <w:lang w:eastAsia="pt-BR"/>
+          <w14:ligatures w14:val="none"/>
+        </w:rPr>
+        <w:t>, como podemos proteger nossa plantação de milho?</w:t>
+      </w:r>
+    </w:p>
+    <w:p>
+      <w:pPr>
+        <w:spacing w:before="100" w:beforeAutospacing="1" w:after="100" w:afterAutospacing="1" w:line="240" w:lineRule="auto"/>
+        <w:rPr>
+          <w:rFonts w:ascii="Times New Roman" w:eastAsia="Times New Roman" w:hAnsi="Times New Roman" w:cs="Times New Roman"/>
+          <w:kern w:val="0"/>
+          <w:lang w:eastAsia="pt-BR"/>
+          <w14:ligatures w14:val="none"/>
+        </w:rPr>
+      </w:pPr>
+      <w:proofErr w:type="spellStart"/>
+      <w:r>
+        <w:rPr>
+          <w:rFonts w:ascii="Times New Roman" w:eastAsia="Times New Roman" w:hAnsi="Times New Roman" w:cs="Times New Roman"/>
+          <w:kern w:val="0"/>
+          <w:lang w:eastAsia="pt-BR"/>
+          <w14:ligatures w14:val="none"/>
+        </w:rPr>
+        <w:t>Agrobot:</w:t>
+      </w:r>
+      <w:proofErr w:type="spellEnd"/>
+    </w:p>
+    <w:p>
+      <w:pPr>
+        <w:spacing w:before="100" w:beforeAutospacing="1" w:after="100" w:afterAutospacing="1" w:line="240" w:lineRule="auto"/>
+        <w:rPr>
+          <w:rFonts w:ascii="Times New Roman" w:eastAsia="Times New Roman" w:hAnsi="Times New Roman" w:cs="Times New Roman"/>
+          <w:kern w:val="0"/>
+          <w:lang w:eastAsia="pt-BR"/>
+          <w14:ligatures w14:val="none"/>
+        </w:rPr>
+      </w:pPr>
+      <w:r>
+        <w:rPr>
+          <w:rFonts w:ascii="Times New Roman" w:eastAsia="Times New Roman" w:hAnsi="Times New Roman" w:cs="Times New Roman"/>
+          <w:kern w:val="0"/>
+          <w:lang w:eastAsia="pt-BR"/>
+          <w14:ligatures w14:val="none"/>
+        </w:rPr>
+        <w:t>P</w:t>
+      </w:r>
+      <w:r>
+        <w:rPr>
+          <w:rFonts w:ascii="Times New Roman" w:eastAsia="Times New Roman" w:hAnsi="Times New Roman" w:cs="Times New Roman"/>
+          <w:kern w:val="0"/>
+          <w:lang w:eastAsia="pt-BR"/>
+          <w14:ligatures w14:val="none"/>
+        </w:rPr>
+        <w:t>rimeiro precisamos monitorar a lavoura e identificar possíveis pragas. Assim, evitamos pulverizações desnecessárias.</w:t>
+      </w:r>
+    </w:p>
+    <w:p>
+      <w:pPr>
+        <w:spacing w:before="100" w:beforeAutospacing="1" w:after="100" w:afterAutospacing="1" w:line="240" w:lineRule="auto"/>
+        <w:rPr>
+          <w:rFonts w:ascii="Times New Roman" w:eastAsia="Times New Roman" w:hAnsi="Times New Roman" w:cs="Times New Roman"/>
+          <w:kern w:val="0"/>
+          <w:lang w:eastAsia="pt-BR"/>
+          <w14:ligatures w14:val="none"/>
+        </w:rPr>
+      </w:pPr>
+      <w:r>
+        <w:rPr>
+          <w:rFonts w:ascii="Times New Roman" w:eastAsia="Times New Roman" w:hAnsi="Times New Roman" w:cs="Times New Roman"/>
+          <w:kern w:val="0"/>
+          <w:lang w:eastAsia="pt-BR"/>
+          <w14:ligatures w14:val="none"/>
+        </w:rPr>
+        <w:t>Produtor:</w:t>
+      </w:r>
+    </w:p>
+    <w:p>
+      <w:pPr>
+        <w:spacing w:before="100" w:beforeAutospacing="1" w:after="100" w:afterAutospacing="1" w:line="240" w:lineRule="auto"/>
+        <w:rPr>
+          <w:rFonts w:ascii="Times New Roman" w:eastAsia="Times New Roman" w:hAnsi="Times New Roman" w:cs="Times New Roman"/>
+          <w:kern w:val="0"/>
+          <w:lang w:eastAsia="pt-BR"/>
+          <w14:ligatures w14:val="none"/>
+        </w:rPr>
+      </w:pPr>
+      <w:r>
+        <w:rPr>
+          <w:rFonts w:ascii="Times New Roman" w:eastAsia="Times New Roman" w:hAnsi="Times New Roman" w:cs="Times New Roman"/>
+          <w:kern w:val="0"/>
+          <w:lang w:eastAsia="pt-BR"/>
+          <w14:ligatures w14:val="none"/>
+        </w:rPr>
+        <w:t>E como podemos fazer isso de forma mais sustentável?</w:t>
+      </w:r>
+    </w:p>
+    <w:p>
+      <w:pPr>
+        <w:spacing w:before="100" w:beforeAutospacing="1" w:after="100" w:afterAutospacing="1" w:line="240" w:lineRule="auto"/>
+        <w:rPr>
+          <w:rFonts w:ascii="Times New Roman" w:eastAsia="Times New Roman" w:hAnsi="Times New Roman" w:cs="Times New Roman"/>
+          <w:kern w:val="0"/>
+          <w:lang w:eastAsia="pt-BR"/>
+          <w14:ligatures w14:val="none"/>
+        </w:rPr>
+      </w:pPr>
+      <w:proofErr w:type="spellStart"/>
+      <w:r>
+        <w:rPr>
+          <w:rFonts w:ascii="Times New Roman" w:eastAsia="Times New Roman" w:hAnsi="Times New Roman" w:cs="Times New Roman"/>
+          <w:kern w:val="0"/>
+          <w:lang w:eastAsia="pt-BR"/>
+          <w14:ligatures w14:val="none"/>
+        </w:rPr>
+        <w:t>Agrobot</w:t>
+      </w:r>
+      <w:proofErr w:type="spellEnd"/>
+      <w:r>
+        <w:rPr>
+          <w:rFonts w:ascii="Times New Roman" w:eastAsia="Times New Roman" w:hAnsi="Times New Roman" w:cs="Times New Roman"/>
+          <w:kern w:val="0"/>
+          <w:lang w:eastAsia="pt-BR"/>
+          <w14:ligatures w14:val="none"/>
+        </w:rPr>
+        <w:t>:</w:t>
+      </w:r>
+    </w:p>
+    <w:p>
+      <w:pPr>
+        <w:spacing w:before="100" w:beforeAutospacing="1" w:after="100" w:afterAutospacing="1" w:line="240" w:lineRule="auto"/>
+        <w:rPr>
+          <w:rFonts w:ascii="Times New Roman" w:eastAsia="Times New Roman" w:hAnsi="Times New Roman" w:cs="Times New Roman"/>
+          <w:kern w:val="0"/>
+          <w:lang w:eastAsia="pt-BR"/>
+          <w14:ligatures w14:val="none"/>
+        </w:rPr>
+      </w:pPr>
+      <w:r>
+        <w:rPr>
+          <w:rFonts w:ascii="Times New Roman" w:eastAsia="Times New Roman" w:hAnsi="Times New Roman" w:cs="Times New Roman"/>
+          <w:kern w:val="0"/>
+          <w:lang w:eastAsia="pt-BR"/>
+          <w14:ligatures w14:val="none"/>
+        </w:rPr>
+        <w:t>Podemos utilizar produtos biológicos, quando adequados à praga identificada, e drones para aplicações mais precisas, reduzindo desperdícios e impactos ambientais.</w:t>
+      </w:r>
+    </w:p>
+    <w:p>
+      <w:pPr>
+        <w:spacing w:before="100" w:beforeAutospacing="1" w:after="100" w:afterAutospacing="1" w:line="240" w:lineRule="auto"/>
+        <w:rPr>
+          <w:rFonts w:ascii="Times New Roman" w:eastAsia="Times New Roman" w:hAnsi="Times New Roman" w:cs="Times New Roman"/>
+          <w:kern w:val="0"/>
+          <w:lang w:eastAsia="pt-BR"/>
+          <w14:ligatures w14:val="none"/>
+        </w:rPr>
+      </w:pPr>
+      <w:r>
+        <w:rPr>
+          <w:rFonts w:ascii="Times New Roman" w:eastAsia="Times New Roman" w:hAnsi="Times New Roman" w:cs="Times New Roman"/>
+          <w:kern w:val="0"/>
+          <w:lang w:eastAsia="pt-BR"/>
+          <w14:ligatures w14:val="none"/>
+        </w:rPr>
+        <w:t>Produtor:</w:t>
+      </w:r>
+    </w:p>
+    <w:p>
+      <w:pPr>
+        <w:spacing w:before="100" w:beforeAutospacing="1" w:after="100" w:afterAutospacing="1" w:line="240" w:lineRule="auto"/>
+        <w:rPr>
+          <w:rFonts w:ascii="Times New Roman" w:eastAsia="Times New Roman" w:hAnsi="Times New Roman" w:cs="Times New Roman"/>
+          <w:kern w:val="0"/>
+          <w:lang w:eastAsia="pt-BR"/>
+          <w14:ligatures w14:val="none"/>
+        </w:rPr>
+      </w:pPr>
+      <w:r>
+        <w:rPr>
+          <w:rFonts w:ascii="Times New Roman" w:eastAsia="Times New Roman" w:hAnsi="Times New Roman" w:cs="Times New Roman"/>
+          <w:kern w:val="0"/>
+          <w:lang w:eastAsia="pt-BR"/>
+          <w14:ligatures w14:val="none"/>
+        </w:rPr>
+        <w:t>Muito bem! Vou buscar o drone na sede.</w:t>
+      </w:r>
+    </w:p>
+    <w:p>
+      <w:pPr>
+        <w:spacing w:before="100" w:beforeAutospacing="1" w:after="100" w:afterAutospacing="1" w:line="240" w:lineRule="auto"/>
+        <w:rPr>
+          <w:rFonts w:ascii="Times New Roman" w:eastAsia="Times New Roman" w:hAnsi="Times New Roman" w:cs="Times New Roman"/>
+          <w:kern w:val="0"/>
+          <w:lang w:eastAsia="pt-BR"/>
+          <w14:ligatures w14:val="none"/>
+        </w:rPr>
+      </w:pPr>
+      <w:proofErr w:type="spellStart"/>
+      <w:r>
+        <w:rPr>
+          <w:rFonts w:ascii="Times New Roman" w:eastAsia="Times New Roman" w:hAnsi="Times New Roman" w:cs="Times New Roman"/>
+          <w:kern w:val="0"/>
+          <w:lang w:eastAsia="pt-BR"/>
+          <w14:ligatures w14:val="none"/>
+        </w:rPr>
+        <w:t>Agrobot</w:t>
+      </w:r>
+      <w:proofErr w:type="spellEnd"/>
+      <w:r>
+        <w:rPr>
+          <w:rFonts w:ascii="Times New Roman" w:eastAsia="Times New Roman" w:hAnsi="Times New Roman" w:cs="Times New Roman"/>
+          <w:kern w:val="0"/>
+          <w:lang w:eastAsia="pt-BR"/>
+          <w14:ligatures w14:val="none"/>
+        </w:rPr>
+        <w:t>:</w:t>
+      </w:r>
+    </w:p>
+    <w:p>
+      <w:pPr>
+        <w:spacing w:before="100" w:beforeAutospacing="1" w:after="100" w:afterAutospacing="1" w:line="240" w:lineRule="auto"/>
+        <w:rPr>
+          <w:rFonts w:ascii="Times New Roman" w:eastAsia="Times New Roman" w:hAnsi="Times New Roman" w:cs="Times New Roman"/>
+          <w:kern w:val="0"/>
+          <w:lang w:eastAsia="pt-BR"/>
+          <w14:ligatures w14:val="none"/>
+        </w:rPr>
+      </w:pPr>
+      <w:r>
+        <w:rPr>
+          <w:rFonts w:ascii="Times New Roman" w:eastAsia="Times New Roman" w:hAnsi="Times New Roman" w:cs="Times New Roman"/>
+          <w:kern w:val="0"/>
+          <w:lang w:eastAsia="pt-BR"/>
+          <w14:ligatures w14:val="none"/>
+        </w:rPr>
+        <w:t>Perfeito,</w:t>
+      </w:r>
+      <w:r>
+        <w:rPr>
+          <w:rFonts w:ascii="Times New Roman" w:eastAsia="Times New Roman" w:hAnsi="Times New Roman" w:cs="Times New Roman"/>
+          <w:kern w:val="0"/>
+          <w:lang w:eastAsia="pt-BR"/>
+          <w14:ligatures w14:val="none"/>
+        </w:rPr>
+        <w:t xml:space="preserve"> </w:t>
+      </w:r>
+      <w:r>
+        <w:rPr>
+          <w:rFonts w:ascii="Times New Roman" w:eastAsia="Times New Roman" w:hAnsi="Times New Roman" w:cs="Times New Roman"/>
+          <w:kern w:val="0"/>
+          <w:lang w:eastAsia="pt-BR"/>
+          <w14:ligatures w14:val="none"/>
+        </w:rPr>
+        <w:t>retorne</w:t>
+      </w:r>
+      <w:r>
+        <w:rPr>
+          <w:rFonts w:ascii="Times New Roman" w:eastAsia="Times New Roman" w:hAnsi="Times New Roman" w:cs="Times New Roman"/>
+          <w:kern w:val="0"/>
+          <w:lang w:eastAsia="pt-BR"/>
+          <w14:ligatures w14:val="none"/>
+        </w:rPr>
+        <w:t xml:space="preserve"> à sede, pegue o drone e volte à plantação para realizar a pulverização planejada.</w:t>
+      </w:r>
+    </w:p>
+    <w:p>
+      <w:pPr>
+        <w:spacing w:before="100" w:beforeAutospacing="1" w:after="100" w:afterAutospacing="1" w:line="240" w:lineRule="auto"/>
+        <w:rPr>
+          <w:rFonts w:ascii="Times New Roman" w:eastAsia="Times New Roman" w:hAnsi="Times New Roman" w:cs="Times New Roman"/>
+          <w:kern w:val="0"/>
+          <w:lang w:eastAsia="pt-BR"/>
+          <w14:ligatures w14:val="none"/>
+        </w:rPr>
+      </w:pPr>
+      <w:r>
+        <w:rPr>
+          <w:rFonts w:ascii="Times New Roman" w:eastAsia="Times New Roman" w:hAnsi="Times New Roman" w:cs="Times New Roman"/>
+          <w:kern w:val="0"/>
+          <w:lang w:eastAsia="pt-BR"/>
+          <w14:ligatures w14:val="none"/>
+        </w:rPr>
+        <w:t>Após a pulverização</w:t>
+      </w:r>
+    </w:p>
+    <w:p>
+      <w:pPr>
+        <w:spacing w:before="100" w:beforeAutospacing="1" w:after="100" w:afterAutospacing="1" w:line="240" w:lineRule="auto"/>
+        <w:rPr>
+          <w:rFonts w:ascii="Times New Roman" w:eastAsia="Times New Roman" w:hAnsi="Times New Roman" w:cs="Times New Roman"/>
+          <w:kern w:val="0"/>
+          <w:lang w:eastAsia="pt-BR"/>
+          <w14:ligatures w14:val="none"/>
+        </w:rPr>
+      </w:pPr>
+      <w:proofErr w:type="spellStart"/>
+      <w:r>
+        <w:rPr>
+          <w:rFonts w:ascii="Times New Roman" w:eastAsia="Times New Roman" w:hAnsi="Times New Roman" w:cs="Times New Roman"/>
+          <w:kern w:val="0"/>
+          <w:lang w:eastAsia="pt-BR"/>
+          <w14:ligatures w14:val="none"/>
+        </w:rPr>
+        <w:t>Agrobot</w:t>
+      </w:r>
+      <w:proofErr w:type="spellEnd"/>
+      <w:r>
+        <w:rPr>
+          <w:rFonts w:ascii="Times New Roman" w:eastAsia="Times New Roman" w:hAnsi="Times New Roman" w:cs="Times New Roman"/>
+          <w:kern w:val="0"/>
+          <w:lang w:eastAsia="pt-BR"/>
+          <w14:ligatures w14:val="none"/>
+        </w:rPr>
+        <w:t>:</w:t>
+      </w:r>
+    </w:p>
+    <w:p>
+      <w:pPr>
+        <w:spacing w:before="100" w:beforeAutospacing="1" w:after="100" w:afterAutospacing="1" w:line="240" w:lineRule="auto"/>
+        <w:rPr>
+          <w:rFonts w:ascii="Times New Roman" w:eastAsia="Times New Roman" w:hAnsi="Times New Roman" w:cs="Times New Roman"/>
+          <w:kern w:val="0"/>
+          <w:lang w:eastAsia="pt-BR"/>
+          <w14:ligatures w14:val="none"/>
+        </w:rPr>
+      </w:pPr>
+      <w:r>
+        <w:rPr>
+          <w:rFonts w:ascii="Times New Roman" w:eastAsia="Times New Roman" w:hAnsi="Times New Roman" w:cs="Times New Roman"/>
+          <w:kern w:val="0"/>
+          <w:lang w:eastAsia="pt-BR"/>
+          <w14:ligatures w14:val="none"/>
+        </w:rPr>
+        <w:t>Aplicação concluída! Agora, vamos monitorar a lavoura para acompanhar os resultados e garantir um manejo mais eficiente e sustentável.</w:t>
       </w:r>
     </w:p>
     <w:p>
@@ -1588,7 +2012,6 @@
   <w:style w:type="character" w:default="1" w:styleId="Fontepargpadro">
     <w:name w:val="Default Paragraph Font"/>
     <w:uiPriority w:val="1"/>
-    <w:semiHidden/>
     <w:unhideWhenUsed/>
   </w:style>
   <w:style w:type="table" w:default="1" w:styleId="Tabelanormal">

</xml_diff>